<commit_message>
Sửa phiếu đề xuất theo bối cảnh live TikTok gắn giỏ Shopee
Thực trạng: chỉ live TikTok, khung 16h–23h; đề xuất thêm máy live song
song Shopee Live và lấp khung 8h–16h.

Co-Authored-By: Claude Opus 5.5 <noreply@anthropic.com>
Claude-Session: https://claude.ai/code/session_01YRCwS4DykMA9Tk52eVN1Wm
</commit_message>
<xml_diff>
--- a/Phieu_de_xuat_mua_thiet_bi_livestream.docx
+++ b/Phieu_de_xuat_mua_thiet_bi_livestream.docx
@@ -939,7 +939,7 @@
         <w:rPr>
           <w:i w:val="0"/>
         </w:rPr>
-        <w:t xml:space="preserve">Đề xuất mua sắm bổ sung 01 bộ thiết bị livestream cho phòng live hiện tại, để cùng 1 host, cùng khung giờ phát song song thêm nền tảng TikTok Shop bên cạnh Shopee. Tổng chi phí dự kiến: </w:t>
+        <w:t xml:space="preserve">Đề xuất mua sắm bổ sung 01 bộ thiết bị livestream cho phòng live hiện tại để: (1) phát song song thêm Shopee Live cùng lúc với TikTok; (2) mở thêm khung giờ 8h–16h đang bỏ trống. Tổng chi phí thiết bị dự kiến: </w:t>
       </w:r>
       <w:r>
         <w:rPr>
@@ -1710,7 +1710,7 @@
         <w:rPr>
           <w:i w:val="0"/>
         </w:rPr>
-        <w:t>Thời gian triển khai: tháng 10/2026. Chi phí khấu hao 24 tháng ≈ 857.475 đ/tháng.</w:t>
+        <w:t>Thời gian triển khai: từ tháng 10/2026. Chi phí khấu hao 24 tháng ≈ 857.475 đ/tháng.</w:t>
       </w:r>
     </w:p>
     <w:p>
@@ -1808,7 +1808,7 @@
         <w:rPr>
           <w:b/>
         </w:rPr>
-        <w:t>1. Thực trạng hiện tại: phòng live chỉ phát 1 nền tảng (Shopee) – đang lãng phí nguồn lực</w:t>
+        <w:t>1. Thực trạng hiện tại: phòng live mới khai thác 1 nền tảng và nửa ngày</w:t>
       </w:r>
       <w:r>
         <w:rPr>
@@ -1825,13 +1825,13 @@
         <w:rPr>
           <w:b/>
         </w:rPr>
-        <w:t xml:space="preserve">- Đã kín giờ nhưng chỉ có 1 kênh thu: </w:t>
+        <w:t xml:space="preserve">- Chỉ live 1 nền tảng: </w:t>
       </w:r>
       <w:r>
         <w:rPr>
           <w:i w:val="0"/>
         </w:rPr>
-        <w:t>61 phiên/30 ngày, 2 ca/ngày (16h–19h và 19h30–22h30), ~6 giờ live/ngày, không nghỉ ngày nào. Host, mặt bằng, điện, internet, sản phẩm mẫu, kịch bản đều đã trả đủ chi phí nhưng chỉ tạo doanh thu từ 1 sàn.</w:t>
+        <w:t>hiện chỉ live TikTok (gắn giỏ hàng Shopee). Phiên live không xuất hiện trên Shopee Live nên bỏ lỡ tập khách đang mua sắm trực tiếp trên Shopee.</w:t>
       </w:r>
     </w:p>
     <w:p>
@@ -1843,13 +1843,13 @@
         <w:rPr>
           <w:b/>
         </w:rPr>
-        <w:t xml:space="preserve">- Lượng xem trên 1 sàn thấp: </w:t>
+        <w:t xml:space="preserve">- Mới dùng khung 16h–23h: </w:t>
       </w:r>
       <w:r>
         <w:rPr>
           <w:i w:val="0"/>
         </w:rPr>
-        <w:t>trung bình 133 người xem/phiên, 1,5 đơn/phiên; 21/61 phiên (34%) không ra đơn nhưng vẫn tốn trọn 3 giờ host.</w:t>
+        <w:t>2 ca/ngày, ~6 giờ live/ngày, 61 phiên/30 ngày. Khung 8h–16h phòng, thiết bị, sản phẩm mẫu đều để trống – chi phí mặt bằng, điện đã trả nhưng không tạo ra doanh thu.</w:t>
       </w:r>
     </w:p>
     <w:p>
@@ -1861,43 +1861,25 @@
         <w:rPr>
           <w:b/>
         </w:rPr>
-        <w:t xml:space="preserve">- Phụ thuộc 1 sàn: </w:t>
+        <w:t xml:space="preserve">- Lượt xem/phiên còn thấp: </w:t>
       </w:r>
       <w:r>
         <w:rPr>
           <w:i w:val="0"/>
         </w:rPr>
-        <w:t>doanh số live phụ thuộc hoàn toàn vào traffic và chính sách của Shopee.</w:t>
+        <w:t>trung bình 133 người xem/phiên, 1,5 đơn/phiên; 21/61 phiên (34%) chưa ra đơn – phụ thuộc vào 1 nguồn traffic duy nhất.</w:t>
       </w:r>
     </w:p>
     <w:p>
       <w:pPr>
         <w:spacing w:after="40" w:before="0" w:line="276" w:lineRule="auto"/>
-        <w:ind w:left="641" w:hanging="283"/>
-      </w:pPr>
-      <w:r>
-        <w:rPr>
-          <w:b/>
-        </w:rPr>
-        <w:t xml:space="preserve">- Phát thêm 1 nền tảng cùng lúc </w:t>
-      </w:r>
-      <w:r>
-        <w:rPr>
-          <w:i w:val="0"/>
-        </w:rPr>
-        <w:t>gần như không phát sinh thêm chi phí host, mặt bằng hay giờ làm – chỉ cần bổ sung thiết bị.</w:t>
-      </w:r>
-    </w:p>
-    <w:p>
-      <w:pPr>
-        <w:spacing w:after="40" w:before="0" w:line="276" w:lineRule="auto"/>
         <w:ind w:left="357"/>
       </w:pPr>
       <w:r>
         <w:rPr>
           <w:b/>
         </w:rPr>
-        <w:t>2. Kết quả live Shopee tháng 9/2026 (01–30/09)</w:t>
+        <w:t>2. Kết quả live TikTok (gắn giỏ Shopee) tháng 9/2026 – chi phí thấp, doanh thu tốt</w:t>
       </w:r>
       <w:r>
         <w:rPr>
@@ -2305,7 +2287,7 @@
               <w:rPr>
                 <w:sz w:val="22"/>
               </w:rPr>
-              <w:t>Giờ live / ngày</w:t>
+              <w:t>Khung giờ / giờ live mỗi ngày</w:t>
             </w:r>
           </w:p>
         </w:tc>
@@ -2323,7 +2305,7 @@
               <w:rPr>
                 <w:sz w:val="22"/>
               </w:rPr>
-              <w:t>6,0 giờ (2 ca × ~3 giờ)</w:t>
+              <w:t>16h–23h / 6,0 giờ (2 ca × ~3 giờ)</w:t>
             </w:r>
           </w:p>
         </w:tc>
@@ -2423,7 +2405,7 @@
         <w:rPr>
           <w:i w:val="0"/>
         </w:rPr>
-        <w:t>- Ca tối (18h–22h30, 31 phiên) đạt 32.508.190 đ và 62 đơn, chiếm 74% doanh thu; ca chiều (30 phiên) đạt 11.591.490 đ và 28 đơn. Chi phí ads chỉ 3,75% doanh thu, đủ cơ sở để nhân rộng sang kênh thứ 2.</w:t>
+        <w:t>- Chỉ với 1.655.889 đ ads (3,75% doanh thu), phòng live đã mang về hơn 44 triệu đồng/tháng. Ca tối (19h30–22h30) đạt 32.508.190 đ, chiếm 74% doanh thu; ca chiều (16h–19h) đạt 11.591.490 đ. Mô hình đã chứng minh hiệu quả, cần nhân rộng sang nền tảng và khung giờ còn trống.</w:t>
       </w:r>
     </w:p>
     <w:p>
@@ -2435,7 +2417,7 @@
         <w:rPr>
           <w:b/>
         </w:rPr>
-        <w:t>3. Mong muốn triển khai</w:t>
+        <w:t>3. Mong muốn triển khai: tăng doanh thu nhưng không tăng nhiều chi phí</w:t>
       </w:r>
       <w:r>
         <w:rPr>
@@ -2452,13 +2434,13 @@
         <w:rPr>
           <w:b/>
         </w:rPr>
-        <w:t xml:space="preserve">- Giai đoạn 1 (tháng 10–12/2026): </w:t>
+        <w:t xml:space="preserve">- Bước 1 – Thêm máy, live 2 nền tảng (tháng 10/2026): </w:t>
       </w:r>
       <w:r>
         <w:rPr>
           <w:i w:val="0"/>
         </w:rPr>
-        <w:t>thêm 01 bộ máy để phát đồng thời Shopee + TikTok Shop, giữ nguyên 2 ca/ngày, ưu tiên ca tối; dùng TV 43 inch để host đọc bình luận, đơn hàng của cả 2 sàn cùng lúc. Không tăng host, không tăng giờ live.</w:t>
+        <w:t>bộ máy mới phát Shopee Live song song với TikTok trong khung 16h–23h; TV 43 inch để host đọc bình luận, đơn hàng của cả 2 nền tảng cùng lúc. Không tăng host, không tăng giờ live – chỉ tốn chi phí thiết bị.</w:t>
       </w:r>
     </w:p>
     <w:p>
@@ -2470,17 +2452,35 @@
         <w:rPr>
           <w:b/>
         </w:rPr>
-        <w:t xml:space="preserve">- Giai đoạn 2 (từ tháng 01/2027, nếu đạt KPI): </w:t>
+        <w:t xml:space="preserve">- Bước 2 – Lấp khung 8h–16h (tháng 11/2026): </w:t>
       </w:r>
       <w:r>
         <w:rPr>
           <w:i w:val="0"/>
         </w:rPr>
-        <w:t>khi kênh mới đạt mốc hoàn vốn (mục 4), bố trí thêm phòng và máy để chạy ca riêng/host thứ 2; chuyển ca chiều kém hiệu quả sang khung giờ vàng của từng sàn.</w:t>
+        <w:t>mở thêm 2 ca 9h–12h và 13h–16h, dùng chung phòng và 2 bộ máy (TikTok + Shopee). Chi phí tăng thêm chủ yếu là host ca ngày (part-time hoặc luân phiên nhân sự sẵn có): ………… đ/tháng.</w:t>
       </w:r>
     </w:p>
     <w:p>
       <w:pPr>
+        <w:spacing w:after="40" w:before="0" w:line="276" w:lineRule="auto"/>
+        <w:ind w:left="641" w:hanging="283"/>
+      </w:pPr>
+      <w:r>
+        <w:rPr>
+          <w:b/>
+        </w:rPr>
+        <w:t xml:space="preserve">- Bước 3 – Thêm phòng (từ tháng 01/2027, nếu đạt KPI): </w:t>
+      </w:r>
+      <w:r>
+        <w:rPr>
+          <w:i w:val="0"/>
+        </w:rPr>
+        <w:t>khi 2 bước trên đạt KPI, bố trí thêm phòng và máy để chạy ca song song hoặc mở thêm nền tảng (Facebook).</w:t>
+      </w:r>
+    </w:p>
+    <w:p>
+      <w:pPr>
         <w:spacing w:after="120" w:before="0" w:line="276" w:lineRule="auto"/>
         <w:ind w:left="641" w:hanging="283"/>
       </w:pPr>
@@ -2494,7 +2494,7 @@
         <w:rPr>
           <w:i w:val="0"/>
         </w:rPr>
-        <w:t>mở/xác minh shop và quyền live TikTok Shop, đồng bộ giá và voucher giữa 2 sàn, kiểm tra băng thông internet đủ đẩy 2 luồng.</w:t>
+        <w:t>bật quyền Shopee Live cho shop, đồng bộ giá và voucher giữa link TikTok và Shopee Live, kiểm tra băng thông internet đủ đẩy 2 luồng.</w:t>
       </w:r>
     </w:p>
     <w:p>
@@ -2506,7 +2506,7 @@
         <w:rPr>
           <w:b/>
         </w:rPr>
-        <w:t>4. Hiệu quả dự kiến và thời gian hoàn vốn</w:t>
+        <w:t>4. Hiệu quả dự kiến và thời gian hoàn vốn thiết bị</w:t>
       </w:r>
       <w:r>
         <w:rPr>
@@ -2523,7 +2523,7 @@
         <w:rPr>
           <w:i w:val="0"/>
         </w:rPr>
-        <w:t>- Giả định biên lợi nhuận đóng góp 40% (sau giá vốn 30%, ads, phí sàn). Để hoàn vốn 20.579.400 đ trong 3 tháng, kênh mới cần đạt 17.149.500 đ/tháng ≈ 39% doanh số Shopee tháng 9.</w:t>
+        <w:t>- Giả định biên lợi nhuận đóng góp 40% (sau giá vốn 30%, ads, phí sàn). Để hoàn vốn 20.579.400 đ trong 3 tháng, phần doanh thu tăng thêm (Shopee Live + khung 8h–16h) cần đạt 17.149.500 đ/tháng ≈ 39% doanh thu tháng 9.</w:t>
       </w:r>
     </w:p>
     <w:tbl>
@@ -2556,7 +2556,7 @@
                 <w:b/>
                 <w:sz w:val="22"/>
               </w:rPr>
-              <w:t>Kịch bản kênh mới</w:t>
+              <w:t>Kịch bản doanh thu tăng thêm</w:t>
             </w:r>
           </w:p>
         </w:tc>
@@ -2635,7 +2635,7 @@
               <w:rPr>
                 <w:sz w:val="22"/>
               </w:rPr>
-              <w:t>Thận trọng (30% Shopee T9)</w:t>
+              <w:t>Thận trọng (+30% so với T9)</w:t>
             </w:r>
           </w:p>
         </w:tc>
@@ -2708,7 +2708,7 @@
               <w:rPr>
                 <w:sz w:val="22"/>
               </w:rPr>
-              <w:t>Cơ sở (50% Shopee T9)</w:t>
+              <w:t>Cơ sở (+50% so với T9)</w:t>
             </w:r>
           </w:p>
         </w:tc>
@@ -2781,7 +2781,7 @@
               <w:rPr>
                 <w:sz w:val="22"/>
               </w:rPr>
-              <w:t>Tốt (100% Shopee T9)</w:t>
+              <w:t>Tốt (+100% so với T9)</w:t>
             </w:r>
           </w:p>
         </w:tc>
@@ -2854,6 +2854,18 @@
     </w:p>
     <w:p>
       <w:pPr>
+        <w:spacing w:after="80" w:before="0" w:line="276" w:lineRule="auto"/>
+        <w:ind w:left="357"/>
+      </w:pPr>
+      <w:r>
+        <w:rPr>
+          <w:i/>
+        </w:rPr>
+        <w:t>Thời gian hoàn vốn chỉ tính chi phí thiết bị, chưa tính chi phí host ca ngày ở Bước 2.</w:t>
+      </w:r>
+    </w:p>
+    <w:p>
+      <w:pPr>
         <w:spacing w:after="120" w:before="0" w:line="276" w:lineRule="auto"/>
         <w:ind w:left="357"/>
       </w:pPr>
@@ -2861,7 +2873,7 @@
         <w:rPr>
           <w:i w:val="0"/>
         </w:rPr>
-        <w:t>Kính đề nghị Ban Giám đốc xem xét, phê duyệt ngân sách 20.579.400 đ để triển khai Giai đoạn 1. Sau 1 tháng vận hành, bộ phận sẽ báo cáo doanh số kênh mới làm căn cứ mở Giai đoạn 2.</w:t>
+        <w:t>Kính đề nghị Ban Giám đốc xem xét, phê duyệt ngân sách 20.579.400 đ để triển khai Bước 1 và Bước 2. Sau 1 tháng vận hành, bộ phận sẽ báo cáo doanh số Shopee Live và khung giờ ngày làm căn cứ mở Bước 3.</w:t>
       </w:r>
     </w:p>
     <w:p>

</xml_diff>

<commit_message>
Sửa phiếu đề xuất: thêm máy live Shopee khung 8h–16h
Khung 16h–23h đã live song song TikTok + Shopee (số liệu tháng 9);
khung sáng – chiều mới live TikTok nên đề xuất gắn thêm 1 máy live Shopee.

Co-Authored-By: Claude Opus 5.5 <noreply@anthropic.com>
Claude-Session: https://claude.ai/code/session_01YRCwS4DykMA9Tk52eVN1Wm
</commit_message>
<xml_diff>
--- a/Phieu_de_xuat_mua_thiet_bi_livestream.docx
+++ b/Phieu_de_xuat_mua_thiet_bi_livestream.docx
@@ -939,7 +939,7 @@
         <w:rPr>
           <w:i w:val="0"/>
         </w:rPr>
-        <w:t xml:space="preserve">Đề xuất mua sắm bổ sung 01 bộ thiết bị livestream cho phòng live hiện tại để: (1) phát song song thêm Shopee Live cùng lúc với TikTok; (2) mở thêm khung giờ 8h–16h đang bỏ trống. Tổng chi phí thiết bị dự kiến: </w:t>
+        <w:t xml:space="preserve">Đề xuất mua sắm bổ sung 01 bộ thiết bị livestream để live Shopee song song với TikTok trong khung giờ sáng – chiều (8h–16h), hiện khung này mới chỉ live TikTok. Tổng chi phí thiết bị dự kiến: </w:t>
       </w:r>
       <w:r>
         <w:rPr>
@@ -1808,7 +1808,7 @@
         <w:rPr>
           <w:b/>
         </w:rPr>
-        <w:t>1. Thực trạng hiện tại: phòng live mới khai thác 1 nền tảng và nửa ngày</w:t>
+        <w:t>1. Thực trạng hiện tại: khung sáng – chiều mới live 1 nền tảng, đang lãng phí</w:t>
       </w:r>
       <w:r>
         <w:rPr>
@@ -1825,13 +1825,13 @@
         <w:rPr>
           <w:b/>
         </w:rPr>
-        <w:t xml:space="preserve">- Chỉ live 1 nền tảng: </w:t>
+        <w:t xml:space="preserve">- Khung 16h–23h: </w:t>
       </w:r>
       <w:r>
         <w:rPr>
           <w:i w:val="0"/>
         </w:rPr>
-        <w:t>hiện chỉ live TikTok (gắn giỏ hàng Shopee). Phiên live không xuất hiện trên Shopee Live nên bỏ lỡ tập khách đang mua sắm trực tiếp trên Shopee.</w:t>
+        <w:t>đã live song song TikTok và Shopee, cùng 1 host, cùng 1 phòng.</w:t>
       </w:r>
     </w:p>
     <w:p>
@@ -1843,13 +1843,13 @@
         <w:rPr>
           <w:b/>
         </w:rPr>
-        <w:t xml:space="preserve">- Mới dùng khung 16h–23h: </w:t>
+        <w:t xml:space="preserve">- Khung 8h–16h: </w:t>
       </w:r>
       <w:r>
         <w:rPr>
           <w:i w:val="0"/>
         </w:rPr>
-        <w:t>2 ca/ngày, ~6 giờ live/ngày, 61 phiên/30 ngày. Khung 8h–16h phòng, thiết bị, sản phẩm mẫu đều để trống – chi phí mặt bằng, điện đã trả nhưng không tạo ra doanh thu.</w:t>
+        <w:t>mới chỉ live TikTok. Host, phòng, sản phẩm mẫu, kịch bản đều đã có và đã trả chi phí nhưng chỉ phục vụ khách của 1 nền tảng.</w:t>
       </w:r>
     </w:p>
     <w:p>
@@ -1861,13 +1861,13 @@
         <w:rPr>
           <w:b/>
         </w:rPr>
-        <w:t xml:space="preserve">- Lượt xem/phiên còn thấp: </w:t>
+        <w:t xml:space="preserve">- Bỏ lỡ khách Shopee: </w:t>
       </w:r>
       <w:r>
         <w:rPr>
           <w:i w:val="0"/>
         </w:rPr>
-        <w:t>trung bình 133 người xem/phiên, 1,5 đơn/phiên; 21/61 phiên (34%) chưa ra đơn – phụ thuộc vào 1 nguồn traffic duy nhất.</w:t>
+        <w:t>cả buổi sáng – chiều, khách đang mua sắm trên Shopee không thấy phiên live của shop.</w:t>
       </w:r>
     </w:p>
     <w:p>
@@ -1879,7 +1879,7 @@
         <w:rPr>
           <w:b/>
         </w:rPr>
-        <w:t>2. Kết quả live TikTok (gắn giỏ Shopee) tháng 9/2026 – chi phí thấp, doanh thu tốt</w:t>
+        <w:t>2. Kết quả live Shopee khung 16h–23h tháng 9/2026 (live song song cùng TikTok)</w:t>
       </w:r>
       <w:r>
         <w:rPr>
@@ -2213,7 +2213,7 @@
               <w:rPr>
                 <w:sz w:val="22"/>
               </w:rPr>
-              <w:t>Chi phí host</w:t>
+              <w:t>Chi phí host tăng thêm</w:t>
             </w:r>
           </w:p>
         </w:tc>
@@ -2231,7 +2231,7 @@
               <w:rPr>
                 <w:sz w:val="22"/>
               </w:rPr>
-              <w:t>………………… đ/tháng</w:t>
+              <w:t>0 đ (dùng chung host đang live TikTok)</w:t>
             </w:r>
           </w:p>
         </w:tc>
@@ -2287,7 +2287,7 @@
               <w:rPr>
                 <w:sz w:val="22"/>
               </w:rPr>
-              <w:t>Khung giờ / giờ live mỗi ngày</w:t>
+              <w:t>Giờ live / ngày</w:t>
             </w:r>
           </w:p>
         </w:tc>
@@ -2305,7 +2305,7 @@
               <w:rPr>
                 <w:sz w:val="22"/>
               </w:rPr>
-              <w:t>16h–23h / 6,0 giờ (2 ca × ~3 giờ)</w:t>
+              <w:t>6,0 giờ (2 ca × ~3 giờ)</w:t>
             </w:r>
           </w:p>
         </w:tc>
@@ -2405,7 +2405,7 @@
         <w:rPr>
           <w:i w:val="0"/>
         </w:rPr>
-        <w:t>- Chỉ với 1.655.889 đ ads (3,75% doanh thu), phòng live đã mang về hơn 44 triệu đồng/tháng. Ca tối (19h30–22h30) đạt 32.508.190 đ, chiếm 74% doanh thu; ca chiều (16h–19h) đạt 11.591.490 đ. Mô hình đã chứng minh hiệu quả, cần nhân rộng sang nền tảng và khung giờ còn trống.</w:t>
+        <w:t>- Chỉ cần thêm máy và 1.655.889 đ ads (3,75% doanh thu), không thêm host, khung 16h–23h trên Shopee đã mang về hơn 44 triệu đồng/tháng. Đây là phần doanh thu tăng thêm gần như "không tốn" nhân sự.</w:t>
       </w:r>
     </w:p>
     <w:p>
@@ -2417,7 +2417,7 @@
         <w:rPr>
           <w:b/>
         </w:rPr>
-        <w:t>3. Mong muốn triển khai: tăng doanh thu nhưng không tăng nhiều chi phí</w:t>
+        <w:t>3. Mong muốn triển khai</w:t>
       </w:r>
       <w:r>
         <w:rPr>
@@ -2434,13 +2434,13 @@
         <w:rPr>
           <w:b/>
         </w:rPr>
-        <w:t xml:space="preserve">- Bước 1 – Thêm máy, live 2 nền tảng (tháng 10/2026): </w:t>
+        <w:t xml:space="preserve">- Thêm 1 máy live Shopee khung sáng – chiều (tháng 10/2026): </w:t>
       </w:r>
       <w:r>
         <w:rPr>
           <w:i w:val="0"/>
         </w:rPr>
-        <w:t>bộ máy mới phát Shopee Live song song với TikTok trong khung 16h–23h; TV 43 inch để host đọc bình luận, đơn hàng của cả 2 nền tảng cùng lúc. Không tăng host, không tăng giờ live – chỉ tốn chi phí thiết bị.</w:t>
+        <w:t>gắn thêm 01 bộ máy để live Shopee song song với TikTok trong khung 8h–16h, cùng host, cùng phòng, cùng sản phẩm. TV 43 inch giúp host đọc bình luận, đơn hàng của cả 2 nền tảng cùng lúc.</w:t>
       </w:r>
     </w:p>
     <w:p>
@@ -2452,70 +2452,52 @@
         <w:rPr>
           <w:b/>
         </w:rPr>
-        <w:t xml:space="preserve">- Bước 2 – Lấp khung 8h–16h (tháng 11/2026): </w:t>
+        <w:t xml:space="preserve">- Chi phí tăng thêm: </w:t>
       </w:r>
       <w:r>
         <w:rPr>
           <w:i w:val="0"/>
         </w:rPr>
-        <w:t>mở thêm 2 ca 9h–12h và 13h–16h, dùng chung phòng và 2 bộ máy (TikTok + Shopee). Chi phí tăng thêm chủ yếu là host ca ngày (part-time hoặc luân phiên nhân sự sẵn có): ………… đ/tháng.</w:t>
+        <w:t>không tăng host, không tăng giờ làm; chỉ phát sinh chi phí thiết bị (một lần) và ngân sách ads Shopee (dự kiến ~3–4% doanh thu như khung tối).</w:t>
       </w:r>
     </w:p>
     <w:p>
       <w:pPr>
-        <w:spacing w:after="40" w:before="0" w:line="276" w:lineRule="auto"/>
+        <w:spacing w:after="120" w:before="0" w:line="276" w:lineRule="auto"/>
         <w:ind w:left="641" w:hanging="283"/>
       </w:pPr>
       <w:r>
         <w:rPr>
           <w:b/>
         </w:rPr>
-        <w:t xml:space="preserve">- Bước 3 – Thêm phòng (từ tháng 01/2027, nếu đạt KPI): </w:t>
+        <w:t xml:space="preserve">- Tiếp theo: </w:t>
       </w:r>
       <w:r>
         <w:rPr>
           <w:i w:val="0"/>
         </w:rPr>
-        <w:t>khi 2 bước trên đạt KPI, bố trí thêm phòng và máy để chạy ca song song hoặc mở thêm nền tảng (Facebook).</w:t>
+        <w:t>nếu khung sáng – chiều đạt hiệu quả, xem xét bố trí thêm máy, thêm phòng để mở rộng tiếp.</w:t>
       </w:r>
     </w:p>
     <w:p>
       <w:pPr>
-        <w:spacing w:after="120" w:before="0" w:line="276" w:lineRule="auto"/>
-        <w:ind w:left="641" w:hanging="283"/>
-      </w:pPr>
-      <w:r>
-        <w:rPr>
-          <w:b/>
-        </w:rPr>
-        <w:t xml:space="preserve">- Chuẩn bị kèm theo: </w:t>
+        <w:spacing w:after="40" w:before="0" w:line="276" w:lineRule="auto"/>
+        <w:ind w:left="357"/>
+      </w:pPr>
+      <w:r>
+        <w:rPr>
+          <w:b/>
+        </w:rPr>
+        <w:t>4. Hiệu quả dự kiến và thời gian hoàn vốn thiết bị</w:t>
       </w:r>
       <w:r>
         <w:rPr>
           <w:i w:val="0"/>
         </w:rPr>
-        <w:t>bật quyền Shopee Live cho shop, đồng bộ giá và voucher giữa link TikTok và Shopee Live, kiểm tra băng thông internet đủ đẩy 2 luồng.</w:t>
       </w:r>
     </w:p>
     <w:p>
       <w:pPr>
-        <w:spacing w:after="40" w:before="0" w:line="276" w:lineRule="auto"/>
-        <w:ind w:left="357"/>
-      </w:pPr>
-      <w:r>
-        <w:rPr>
-          <w:b/>
-        </w:rPr>
-        <w:t>4. Hiệu quả dự kiến và thời gian hoàn vốn thiết bị</w:t>
-      </w:r>
-      <w:r>
-        <w:rPr>
-          <w:i w:val="0"/>
-        </w:rPr>
-      </w:r>
-    </w:p>
-    <w:p>
-      <w:pPr>
         <w:spacing w:after="60" w:before="0" w:line="276" w:lineRule="auto"/>
         <w:ind w:left="641" w:hanging="283"/>
       </w:pPr>
@@ -2523,7 +2505,7 @@
         <w:rPr>
           <w:i w:val="0"/>
         </w:rPr>
-        <w:t>- Giả định biên lợi nhuận đóng góp 40% (sau giá vốn 30%, ads, phí sàn). Để hoàn vốn 20.579.400 đ trong 3 tháng, phần doanh thu tăng thêm (Shopee Live + khung 8h–16h) cần đạt 17.149.500 đ/tháng ≈ 39% doanh thu tháng 9.</w:t>
+        <w:t>- Giả định biên lợi nhuận đóng góp 40% (sau giá vốn 30%, ads, phí sàn). Để hoàn vốn 20.579.400 đ trong 3 tháng, Shopee khung sáng – chiều cần đạt 17.149.500 đ/tháng ≈ 39% doanh thu Shopee khung tối tháng 9.</w:t>
       </w:r>
     </w:p>
     <w:tbl>
@@ -2556,7 +2538,7 @@
                 <w:b/>
                 <w:sz w:val="22"/>
               </w:rPr>
-              <w:t>Kịch bản doanh thu tăng thêm</w:t>
+              <w:t>Kịch bản Shopee khung 8h–16h</w:t>
             </w:r>
           </w:p>
         </w:tc>
@@ -2635,7 +2617,7 @@
               <w:rPr>
                 <w:sz w:val="22"/>
               </w:rPr>
-              <w:t>Thận trọng (+30% so với T9)</w:t>
+              <w:t>Thận trọng (30% khung tối T9)</w:t>
             </w:r>
           </w:p>
         </w:tc>
@@ -2708,7 +2690,7 @@
               <w:rPr>
                 <w:sz w:val="22"/>
               </w:rPr>
-              <w:t>Cơ sở (+50% so với T9)</w:t>
+              <w:t>Cơ sở (50% khung tối T9)</w:t>
             </w:r>
           </w:p>
         </w:tc>
@@ -2781,7 +2763,7 @@
               <w:rPr>
                 <w:sz w:val="22"/>
               </w:rPr>
-              <w:t>Tốt (+100% so với T9)</w:t>
+              <w:t>Tốt (100% khung tối T9)</w:t>
             </w:r>
           </w:p>
         </w:tc>
@@ -2854,18 +2836,6 @@
     </w:p>
     <w:p>
       <w:pPr>
-        <w:spacing w:after="80" w:before="0" w:line="276" w:lineRule="auto"/>
-        <w:ind w:left="357"/>
-      </w:pPr>
-      <w:r>
-        <w:rPr>
-          <w:i/>
-        </w:rPr>
-        <w:t>Thời gian hoàn vốn chỉ tính chi phí thiết bị, chưa tính chi phí host ca ngày ở Bước 2.</w:t>
-      </w:r>
-    </w:p>
-    <w:p>
-      <w:pPr>
         <w:spacing w:after="120" w:before="0" w:line="276" w:lineRule="auto"/>
         <w:ind w:left="357"/>
       </w:pPr>
@@ -2873,7 +2843,7 @@
         <w:rPr>
           <w:i w:val="0"/>
         </w:rPr>
-        <w:t>Kính đề nghị Ban Giám đốc xem xét, phê duyệt ngân sách 20.579.400 đ để triển khai Bước 1 và Bước 2. Sau 1 tháng vận hành, bộ phận sẽ báo cáo doanh số Shopee Live và khung giờ ngày làm căn cứ mở Bước 3.</w:t>
+        <w:t>Kính đề nghị Ban Giám đốc xem xét, phê duyệt ngân sách 20.579.400 đ để gắn thêm máy live Shopee khung sáng – chiều. Sau 1 tháng vận hành, bộ phận sẽ báo cáo kết quả làm căn cứ mở rộng thêm.</w:t>
       </w:r>
     </w:p>
     <w:p>

</xml_diff>

<commit_message>
Điền thông tin người đề xuất và nguồn báo giá thiết bị
Co-Authored-By: Claude Opus 5.5 <noreply@anthropic.com>
Claude-Session: https://claude.ai/code/session_01YRCwS4DykMA9Tk52eVN1Wm
</commit_message>
<xml_diff>
--- a/Phieu_de_xuat_mua_thiet_bi_livestream.docx
+++ b/Phieu_de_xuat_mua_thiet_bi_livestream.docx
@@ -720,7 +720,7 @@
         <w:t xml:space="preserve"> CBNV:</w:t>
       </w:r>
       <w:r>
-        <w:t xml:space="preserve"> </w:t>
+        <w:t xml:space="preserve"> Nguyễn Văn Việt</w:t>
       </w:r>
     </w:p>
     <w:p>
@@ -767,7 +767,10 @@
         <w:rPr>
           <w:color w:val="000000"/>
         </w:rPr>
-        <w:t xml:space="preserve">:  </w:t>
+        <w:t>:</w:t>
+      </w:r>
+      <w:r>
+        <w:t xml:space="preserve"> Lead Sàn</w:t>
       </w:r>
     </w:p>
     <w:p>
@@ -828,7 +831,10 @@
         <w:rPr>
           <w:color w:val="000000"/>
         </w:rPr>
-        <w:t xml:space="preserve">/Ban: </w:t>
+        <w:t>/Ban:</w:t>
+      </w:r>
+      <w:r>
+        <w:t xml:space="preserve"> Kinh doanh</w:t>
       </w:r>
     </w:p>
     <w:p>
@@ -1699,6 +1705,18 @@
         <w:rPr>
           <w:i w:val="0"/>
         </w:rPr>
+      </w:r>
+    </w:p>
+    <w:p>
+      <w:pPr>
+        <w:spacing w:after="40" w:before="0" w:line="276" w:lineRule="auto"/>
+        <w:ind w:left="357"/>
+      </w:pPr>
+      <w:r>
+        <w:rPr>
+          <w:i/>
+        </w:rPr>
+        <w:t>Đơn giá theo bảng "Mô hình chi phí phòng livestream" – sheet Thiết bị: https://docs.google.com/spreadsheets/d/1HCntODD53eT1RHjrPUs-ed93stcig970wi0pGeMwZks</w:t>
       </w:r>
     </w:p>
     <w:p>
@@ -3389,11 +3407,20 @@
                 <w:b/>
               </w:rPr>
             </w:pPr>
+            <w:r/>
+          </w:p>
+          <w:p/>
+          <w:p/>
+          <w:p/>
+          <w:p>
+            <w:pPr>
+              <w:jc w:val="center"/>
+            </w:pPr>
             <w:r>
               <w:rPr>
                 <w:b/>
               </w:rPr>
-              <w:t xml:space="preserve">         </w:t>
+              <w:t>Nguyễn Văn Việt</w:t>
             </w:r>
           </w:p>
         </w:tc>

</xml_diff>